<commit_message>
:sparkles: feat: create home and admin pages
</commit_message>
<xml_diff>
--- a/registro-colmeia/documentacao/rascunho geral.docx
+++ b/registro-colmeia/documentacao/rascunho geral.docx
@@ -1,6 +1,6 @@
 
 <file path=word/document.xml><?xml version="1.0" encoding="utf-8"?>
-<w:document xmlns:wpc="http://schemas.microsoft.com/office/word/2010/wordprocessingCanvas" xmlns:cx="http://schemas.microsoft.com/office/drawing/2014/chartex" xmlns:cx1="http://schemas.microsoft.com/office/drawing/2015/9/8/chartex" xmlns:cx2="http://schemas.microsoft.com/office/drawing/2015/10/21/chartex" xmlns:cx3="http://schemas.microsoft.com/office/drawing/2016/5/9/chartex" xmlns:cx4="http://schemas.microsoft.com/office/drawing/2016/5/10/chartex" xmlns:cx5="http://schemas.microsoft.com/office/drawing/2016/5/11/chartex" xmlns:cx6="http://schemas.microsoft.com/office/drawing/2016/5/12/chartex" xmlns:cx7="http://schemas.microsoft.com/office/drawing/2016/5/13/chartex" xmlns:cx8="http://schemas.microsoft.com/office/drawing/2016/5/14/chartex" xmlns:mc="http://schemas.openxmlformats.org/markup-compatibility/2006" xmlns:aink="http://schemas.microsoft.com/office/drawing/2016/ink" xmlns:am3d="http://schemas.microsoft.com/office/drawing/2017/model3d" xmlns:o="urn:schemas-microsoft-com:office:office" xmlns:oel="http://schemas.microsoft.com/office/2019/extlst" xmlns:r="http://schemas.openxmlformats.org/officeDocument/2006/relationships" xmlns:m="http://schemas.openxmlformats.org/officeDocument/2006/math" xmlns:v="urn:schemas-microsoft-com:vml" xmlns:wp14="http://schemas.microsoft.com/office/word/2010/wordprocessingDrawing" xmlns:wp="http://schemas.openxmlformats.org/drawingml/2006/wordprocessingDrawing" xmlns:w10="urn:schemas-microsoft-com:office:word" xmlns:w="http://schemas.openxmlformats.org/wordprocessingml/2006/main" xmlns:w14="http://schemas.microsoft.com/office/word/2010/wordml" xmlns:w15="http://schemas.microsoft.com/office/word/2012/wordml" xmlns:w16cex="http://schemas.microsoft.com/office/word/2018/wordml/cex" xmlns:w16cid="http://schemas.microsoft.com/office/word/2016/wordml/cid" xmlns:w16="http://schemas.microsoft.com/office/word/2018/wordml" xmlns:w16du="http://schemas.microsoft.com/office/word/2023/wordml/word16du" xmlns:w16sdtdh="http://schemas.microsoft.com/office/word/2020/wordml/sdtdatahash" xmlns:w16sdtfl="http://schemas.microsoft.com/office/word/2024/wordml/sdtformatlock" xmlns:w16se="http://schemas.microsoft.com/office/word/2015/wordml/symex" xmlns:wpg="http://schemas.microsoft.com/office/word/2010/wordprocessingGroup" xmlns:wpi="http://schemas.microsoft.com/office/word/2010/wordprocessingInk" xmlns:wne="http://schemas.microsoft.com/office/word/2006/wordml" xmlns:wps="http://schemas.microsoft.com/office/word/2010/wordprocessingShape" mc:Ignorable="w14 w15 w16se w16cid w16 w16cex w16sdtdh w16sdtfl w16du wp14">
+<w:document xmlns:wpc="http://schemas.microsoft.com/office/word/2010/wordprocessingCanvas" xmlns:cx="http://schemas.microsoft.com/office/drawing/2014/chartex" xmlns:cx1="http://schemas.microsoft.com/office/drawing/2015/9/8/chartex" xmlns:cx2="http://schemas.microsoft.com/office/drawing/2015/10/21/chartex" xmlns:cx3="http://schemas.microsoft.com/office/drawing/2016/5/9/chartex" xmlns:cx4="http://schemas.microsoft.com/office/drawing/2016/5/10/chartex" xmlns:cx5="http://schemas.microsoft.com/office/drawing/2016/5/11/chartex" xmlns:cx6="http://schemas.microsoft.com/office/drawing/2016/5/12/chartex" xmlns:cx7="http://schemas.microsoft.com/office/drawing/2016/5/13/chartex" xmlns:cx8="http://schemas.microsoft.com/office/drawing/2016/5/14/chartex" xmlns:mc="http://schemas.openxmlformats.org/markup-compatibility/2006" xmlns:aink="http://schemas.microsoft.com/office/drawing/2016/ink" xmlns:am3d="http://schemas.microsoft.com/office/drawing/2017/model3d" xmlns:o="urn:schemas-microsoft-com:office:office" xmlns:oel="http://schemas.microsoft.com/office/2019/extlst" xmlns:r="http://schemas.openxmlformats.org/officeDocument/2006/relationships" xmlns:m="http://schemas.openxmlformats.org/officeDocument/2006/math" xmlns:v="urn:schemas-microsoft-com:vml" xmlns:wp14="http://schemas.microsoft.com/office/word/2010/wordprocessingDrawing" xmlns:wp="http://schemas.openxmlformats.org/drawingml/2006/wordprocessingDrawing" xmlns:w10="urn:schemas-microsoft-com:office:word" xmlns:w="http://schemas.openxmlformats.org/wordprocessingml/2006/main" xmlns:w14="http://schemas.microsoft.com/office/word/2010/wordml" xmlns:w15="http://schemas.microsoft.com/office/word/2012/wordml" xmlns:w16cei="http://schemas.microsoft.com/office/word/2026/wordml/cei" xmlns:w16cex="http://schemas.microsoft.com/office/word/2018/wordml/cex" xmlns:w16cid="http://schemas.microsoft.com/office/word/2016/wordml/cid" xmlns:w16="http://schemas.microsoft.com/office/word/2018/wordml" xmlns:w16du="http://schemas.microsoft.com/office/word/2023/wordml/word16du" xmlns:w16sdtdh="http://schemas.microsoft.com/office/word/2020/wordml/sdtdatahash" xmlns:w16sdtfl="http://schemas.microsoft.com/office/word/2024/wordml/sdtformatlock" xmlns:w16se="http://schemas.microsoft.com/office/word/2015/wordml/symex" xmlns:wpg="http://schemas.microsoft.com/office/word/2010/wordprocessingGroup" xmlns:wpi="http://schemas.microsoft.com/office/word/2010/wordprocessingInk" xmlns:wne="http://schemas.microsoft.com/office/word/2006/wordml" xmlns:wps="http://schemas.microsoft.com/office/word/2010/wordprocessingShape" mc:Ignorable="w14 w15 w16se w16cid w16 w16cex w16sdtdh w16sdtfl w16du wp14">
   <w:body>
     <w:p>
       <w:pPr>
@@ -219,34 +219,7 @@
         <w:t>Introdução</w:t>
       </w:r>
       <w:r>
-        <w:t xml:space="preserve">: </w:t>
-      </w:r>
-      <w:r>
-        <w:t>Contextualização</w:t>
-      </w:r>
-      <w:r>
-        <w:t xml:space="preserve">, </w:t>
-      </w:r>
-      <w:r>
-        <w:t>Problema</w:t>
-      </w:r>
-      <w:r>
-        <w:t xml:space="preserve">, </w:t>
-      </w:r>
-      <w:r>
-        <w:t>Objetivo geral</w:t>
-      </w:r>
-      <w:r>
-        <w:t xml:space="preserve">, </w:t>
-      </w:r>
-      <w:r>
-        <w:t>Objetivos específicos</w:t>
-      </w:r>
-      <w:r>
-        <w:t xml:space="preserve"> e </w:t>
-      </w:r>
-      <w:r>
-        <w:t>Organização do artigo</w:t>
+        <w:t>: Contextualização, Problema, Objetivo geral, Objetivos específicos</w:t>
       </w:r>
     </w:p>
     <w:p>
@@ -263,49 +236,10 @@
         <w:t>Revisão de Literatura</w:t>
       </w:r>
       <w:r>
-        <w:t>: o que já existe falando sobre o tema?</w:t>
-      </w:r>
-      <w:r>
-        <w:t xml:space="preserve"> </w:t>
-      </w:r>
-      <w:r>
-        <w:t>Melipona quadrifasciata</w:t>
-      </w:r>
-      <w:r>
-        <w:t xml:space="preserve">, </w:t>
-      </w:r>
-      <w:r>
-        <w:t>Importância ecológica</w:t>
-      </w:r>
-      <w:r>
-        <w:t xml:space="preserve">, </w:t>
-      </w:r>
-      <w:r>
-        <w:t>Ameaças</w:t>
-      </w:r>
-      <w:r>
-        <w:t xml:space="preserve">, </w:t>
-      </w:r>
-      <w:r>
-        <w:t>Meliponicultura</w:t>
-      </w:r>
-      <w:r>
-        <w:t xml:space="preserve">, </w:t>
-      </w:r>
-      <w:r>
-        <w:t>Sistemas de monitoramento</w:t>
-      </w:r>
-      <w:r>
-        <w:t xml:space="preserve">, </w:t>
-      </w:r>
-      <w:r>
-        <w:t>Bancos de dados científicos</w:t>
-      </w:r>
-      <w:r>
-        <w:t xml:space="preserve"> e </w:t>
-      </w:r>
-      <w:r>
-        <w:t>Trabalhos relacionados</w:t>
+        <w:t xml:space="preserve">: </w:t>
+      </w:r>
+      <w:r>
+        <w:t>2.1 - Melipona quadrifasciata e importância ecológica 2.2 – Monitoramento e saúde das colônias 2.3 – Sistemas de Informação para gestão e armazenamento dos dados 2.4 – Bases de dados relacionadas</w:t>
       </w:r>
     </w:p>
     <w:p>
@@ -463,6 +397,9 @@
       <w:r>
         <w:t xml:space="preserve"> pergunta norteadora</w:t>
       </w:r>
+      <w:r>
+        <w:t xml:space="preserve"> (deve se ligar a introdução)</w:t>
+      </w:r>
     </w:p>
     <w:p>
       <w:pPr>
@@ -514,6 +451,16 @@
       <w:r>
         <w:t>Referências</w:t>
       </w:r>
+    </w:p>
+    <w:p>
+      <w:pPr>
+        <w:spacing w:line="360" w:lineRule="auto"/>
+      </w:pPr>
+    </w:p>
+    <w:p>
+      <w:pPr>
+        <w:spacing w:line="360" w:lineRule="auto"/>
+      </w:pPr>
     </w:p>
     <w:sectPr>
       <w:pgSz w:w="11906" w:h="16838"/>
@@ -526,7 +473,7 @@
 </file>
 
 <file path=word/numbering.xml><?xml version="1.0" encoding="utf-8"?>
-<w:numbering xmlns:wpc="http://schemas.microsoft.com/office/word/2010/wordprocessingCanvas" xmlns:cx="http://schemas.microsoft.com/office/drawing/2014/chartex" xmlns:cx1="http://schemas.microsoft.com/office/drawing/2015/9/8/chartex" xmlns:cx2="http://schemas.microsoft.com/office/drawing/2015/10/21/chartex" xmlns:cx3="http://schemas.microsoft.com/office/drawing/2016/5/9/chartex" xmlns:cx4="http://schemas.microsoft.com/office/drawing/2016/5/10/chartex" xmlns:cx5="http://schemas.microsoft.com/office/drawing/2016/5/11/chartex" xmlns:cx6="http://schemas.microsoft.com/office/drawing/2016/5/12/chartex" xmlns:cx7="http://schemas.microsoft.com/office/drawing/2016/5/13/chartex" xmlns:cx8="http://schemas.microsoft.com/office/drawing/2016/5/14/chartex" xmlns:mc="http://schemas.openxmlformats.org/markup-compatibility/2006" xmlns:aink="http://schemas.microsoft.com/office/drawing/2016/ink" xmlns:am3d="http://schemas.microsoft.com/office/drawing/2017/model3d" xmlns:o="urn:schemas-microsoft-com:office:office" xmlns:oel="http://schemas.microsoft.com/office/2019/extlst" xmlns:r="http://schemas.openxmlformats.org/officeDocument/2006/relationships" xmlns:m="http://schemas.openxmlformats.org/officeDocument/2006/math" xmlns:v="urn:schemas-microsoft-com:vml" xmlns:wp14="http://schemas.microsoft.com/office/word/2010/wordprocessingDrawing" xmlns:wp="http://schemas.openxmlformats.org/drawingml/2006/wordprocessingDrawing" xmlns:w10="urn:schemas-microsoft-com:office:word" xmlns:w="http://schemas.openxmlformats.org/wordprocessingml/2006/main" xmlns:w14="http://schemas.microsoft.com/office/word/2010/wordml" xmlns:w15="http://schemas.microsoft.com/office/word/2012/wordml" xmlns:w16cex="http://schemas.microsoft.com/office/word/2018/wordml/cex" xmlns:w16cid="http://schemas.microsoft.com/office/word/2016/wordml/cid" xmlns:w16="http://schemas.microsoft.com/office/word/2018/wordml" xmlns:w16du="http://schemas.microsoft.com/office/word/2023/wordml/word16du" xmlns:w16sdtdh="http://schemas.microsoft.com/office/word/2020/wordml/sdtdatahash" xmlns:w16sdtfl="http://schemas.microsoft.com/office/word/2024/wordml/sdtformatlock" xmlns:w16se="http://schemas.microsoft.com/office/word/2015/wordml/symex" xmlns:wpg="http://schemas.microsoft.com/office/word/2010/wordprocessingGroup" xmlns:wpi="http://schemas.microsoft.com/office/word/2010/wordprocessingInk" xmlns:wne="http://schemas.microsoft.com/office/word/2006/wordml" xmlns:wps="http://schemas.microsoft.com/office/word/2010/wordprocessingShape" mc:Ignorable="w14 w15 w16se w16cid w16 w16cex w16sdtdh w16sdtfl w16du wp14">
+<w:numbering xmlns:wpc="http://schemas.microsoft.com/office/word/2010/wordprocessingCanvas" xmlns:cx="http://schemas.microsoft.com/office/drawing/2014/chartex" xmlns:cx1="http://schemas.microsoft.com/office/drawing/2015/9/8/chartex" xmlns:cx2="http://schemas.microsoft.com/office/drawing/2015/10/21/chartex" xmlns:cx3="http://schemas.microsoft.com/office/drawing/2016/5/9/chartex" xmlns:cx4="http://schemas.microsoft.com/office/drawing/2016/5/10/chartex" xmlns:cx5="http://schemas.microsoft.com/office/drawing/2016/5/11/chartex" xmlns:cx6="http://schemas.microsoft.com/office/drawing/2016/5/12/chartex" xmlns:cx7="http://schemas.microsoft.com/office/drawing/2016/5/13/chartex" xmlns:cx8="http://schemas.microsoft.com/office/drawing/2016/5/14/chartex" xmlns:mc="http://schemas.openxmlformats.org/markup-compatibility/2006" xmlns:aink="http://schemas.microsoft.com/office/drawing/2016/ink" xmlns:am3d="http://schemas.microsoft.com/office/drawing/2017/model3d" xmlns:o="urn:schemas-microsoft-com:office:office" xmlns:oel="http://schemas.microsoft.com/office/2019/extlst" xmlns:r="http://schemas.openxmlformats.org/officeDocument/2006/relationships" xmlns:m="http://schemas.openxmlformats.org/officeDocument/2006/math" xmlns:v="urn:schemas-microsoft-com:vml" xmlns:wp14="http://schemas.microsoft.com/office/word/2010/wordprocessingDrawing" xmlns:wp="http://schemas.openxmlformats.org/drawingml/2006/wordprocessingDrawing" xmlns:w10="urn:schemas-microsoft-com:office:word" xmlns:w="http://schemas.openxmlformats.org/wordprocessingml/2006/main" xmlns:w14="http://schemas.microsoft.com/office/word/2010/wordml" xmlns:w15="http://schemas.microsoft.com/office/word/2012/wordml" xmlns:w16cei="http://schemas.microsoft.com/office/word/2026/wordml/cei" xmlns:w16cex="http://schemas.microsoft.com/office/word/2018/wordml/cex" xmlns:w16cid="http://schemas.microsoft.com/office/word/2016/wordml/cid" xmlns:w16="http://schemas.microsoft.com/office/word/2018/wordml" xmlns:w16du="http://schemas.microsoft.com/office/word/2023/wordml/word16du" xmlns:w16sdtdh="http://schemas.microsoft.com/office/word/2020/wordml/sdtdatahash" xmlns:w16sdtfl="http://schemas.microsoft.com/office/word/2024/wordml/sdtformatlock" xmlns:w16se="http://schemas.microsoft.com/office/word/2015/wordml/symex" xmlns:wpg="http://schemas.microsoft.com/office/word/2010/wordprocessingGroup" xmlns:wpi="http://schemas.microsoft.com/office/word/2010/wordprocessingInk" xmlns:wne="http://schemas.microsoft.com/office/word/2006/wordml" xmlns:wps="http://schemas.microsoft.com/office/word/2010/wordprocessingShape" mc:Ignorable="w14 w15 w16se w16cid w16 w16cex w16sdtdh w16sdtfl w16du wp14">
   <w:abstractNum w:abstractNumId="0" w15:restartNumberingAfterBreak="0">
     <w:nsid w:val="286D0588"/>
     <w:multiLevelType w:val="hybridMultilevel"/>
@@ -1915,6 +1862,7 @@
   <w:style w:type="character" w:default="1" w:styleId="Fontepargpadro">
     <w:name w:val="Default Paragraph Font"/>
     <w:uiPriority w:val="1"/>
+    <w:semiHidden/>
     <w:unhideWhenUsed/>
   </w:style>
   <w:style w:type="table" w:default="1" w:styleId="Tabelanormal">

</xml_diff>

<commit_message>
:books: docs: update drafts
</commit_message>
<xml_diff>
--- a/registro-colmeia/documentacao/rascunho geral.docx
+++ b/registro-colmeia/documentacao/rascunho geral.docx
@@ -214,11 +214,20 @@
           <w:numId w:val="2"/>
         </w:numPr>
         <w:spacing w:line="360" w:lineRule="auto"/>
-      </w:pPr>
-      <w:r>
+        <w:rPr>
+          <w:color w:val="4EA72E" w:themeColor="accent6"/>
+        </w:rPr>
+      </w:pPr>
+      <w:r>
+        <w:rPr>
+          <w:color w:val="4EA72E" w:themeColor="accent6"/>
+        </w:rPr>
         <w:t>Introdução</w:t>
       </w:r>
       <w:r>
+        <w:rPr>
+          <w:color w:val="4EA72E" w:themeColor="accent6"/>
+        </w:rPr>
         <w:t>: Contextualização, Problema, Objetivo geral, Objetivos específicos</w:t>
       </w:r>
     </w:p>
@@ -230,15 +239,27 @@
           <w:numId w:val="2"/>
         </w:numPr>
         <w:spacing w:line="360" w:lineRule="auto"/>
-      </w:pPr>
-      <w:r>
+        <w:rPr>
+          <w:color w:val="4EA72E" w:themeColor="accent6"/>
+        </w:rPr>
+      </w:pPr>
+      <w:r>
+        <w:rPr>
+          <w:color w:val="4EA72E" w:themeColor="accent6"/>
+        </w:rPr>
         <w:lastRenderedPageBreak/>
         <w:t>Revisão de Literatura</w:t>
       </w:r>
       <w:r>
+        <w:rPr>
+          <w:color w:val="4EA72E" w:themeColor="accent6"/>
+        </w:rPr>
         <w:t xml:space="preserve">: </w:t>
       </w:r>
       <w:r>
+        <w:rPr>
+          <w:color w:val="4EA72E" w:themeColor="accent6"/>
+        </w:rPr>
         <w:t>2.1 - Melipona quadrifasciata e importância ecológica 2.2 – Monitoramento e saúde das colônias 2.3 – Sistemas de Informação para gestão e armazenamento dos dados 2.4 – Bases de dados relacionadas</w:t>
       </w:r>
     </w:p>
@@ -250,8 +271,14 @@
           <w:numId w:val="2"/>
         </w:numPr>
         <w:spacing w:line="360" w:lineRule="auto"/>
-      </w:pPr>
-      <w:r>
+        <w:rPr>
+          <w:color w:val="4EA72E" w:themeColor="accent6"/>
+        </w:rPr>
+      </w:pPr>
+      <w:r>
+        <w:rPr>
+          <w:color w:val="4EA72E" w:themeColor="accent6"/>
+        </w:rPr>
         <w:t xml:space="preserve">Metodologia: </w:t>
       </w:r>
     </w:p>
@@ -264,12 +291,12 @@
         </w:numPr>
         <w:spacing w:line="360" w:lineRule="auto"/>
         <w:rPr>
-          <w:color w:val="0E2841" w:themeColor="text2"/>
-        </w:rPr>
-      </w:pPr>
-      <w:r>
-        <w:rPr>
-          <w:color w:val="0E2841" w:themeColor="text2"/>
+          <w:color w:val="4EA72E" w:themeColor="accent6"/>
+        </w:rPr>
+      </w:pPr>
+      <w:r>
+        <w:rPr>
+          <w:color w:val="4EA72E" w:themeColor="accent6"/>
         </w:rPr>
         <w:t>Levantamento de Requisitos: Como você descobriu quais dados precisavam ser coletados (umidade, temperatura, saúde da abelha)?</w:t>
       </w:r>
@@ -283,12 +310,12 @@
         </w:numPr>
         <w:spacing w:line="360" w:lineRule="auto"/>
         <w:rPr>
-          <w:color w:val="0E2841" w:themeColor="text2"/>
-        </w:rPr>
-      </w:pPr>
-      <w:r>
-        <w:rPr>
-          <w:color w:val="0E2841" w:themeColor="text2"/>
+          <w:color w:val="4EA72E" w:themeColor="accent6"/>
+        </w:rPr>
+      </w:pPr>
+      <w:r>
+        <w:rPr>
+          <w:color w:val="4EA72E" w:themeColor="accent6"/>
         </w:rPr>
         <w:t>Escolha Tecnológica: Uma justificativa técnica do motivo pelo qual você escolheu cada linguagem, framework ou tipo de banco de dados, em vez de outras opções disponíveis.</w:t>
       </w:r>
@@ -302,12 +329,12 @@
         </w:numPr>
         <w:spacing w:line="360" w:lineRule="auto"/>
         <w:rPr>
-          <w:color w:val="0E2841" w:themeColor="text2"/>
-        </w:rPr>
-      </w:pPr>
-      <w:r>
-        <w:rPr>
-          <w:color w:val="0E2841" w:themeColor="text2"/>
+          <w:color w:val="4EA72E" w:themeColor="accent6"/>
+        </w:rPr>
+      </w:pPr>
+      <w:r>
+        <w:rPr>
+          <w:color w:val="4EA72E" w:themeColor="accent6"/>
         </w:rPr>
         <w:t>Procedimento de Teste: O método que você definiu para validar se o sistema funciona corretamente.</w:t>
       </w:r>
@@ -320,8 +347,14 @@
           <w:numId w:val="2"/>
         </w:numPr>
         <w:spacing w:line="360" w:lineRule="auto"/>
-      </w:pPr>
-      <w:r>
+        <w:rPr>
+          <w:color w:val="4EA72E" w:themeColor="accent6"/>
+        </w:rPr>
+      </w:pPr>
+      <w:r>
+        <w:rPr>
+          <w:color w:val="4EA72E" w:themeColor="accent6"/>
+        </w:rPr>
         <w:t>Resultados e Discussão</w:t>
       </w:r>
     </w:p>
@@ -329,8 +362,14 @@
       <w:pPr>
         <w:spacing w:line="360" w:lineRule="auto"/>
         <w:ind w:left="360"/>
-      </w:pPr>
-      <w:r>
+        <w:rPr>
+          <w:color w:val="4EA72E" w:themeColor="accent6"/>
+        </w:rPr>
+      </w:pPr>
+      <w:r>
+        <w:rPr>
+          <w:color w:val="4EA72E" w:themeColor="accent6"/>
+        </w:rPr>
         <w:t>4.1 – Arquitetura geral do sistema</w:t>
       </w:r>
     </w:p>
@@ -338,8 +377,14 @@
       <w:pPr>
         <w:spacing w:line="360" w:lineRule="auto"/>
         <w:ind w:left="360"/>
-      </w:pPr>
-      <w:r>
+        <w:rPr>
+          <w:color w:val="4EA72E" w:themeColor="accent6"/>
+        </w:rPr>
+      </w:pPr>
+      <w:r>
+        <w:rPr>
+          <w:color w:val="4EA72E" w:themeColor="accent6"/>
+        </w:rPr>
         <w:t>4.2 – Banco de dados</w:t>
       </w:r>
     </w:p>
@@ -347,8 +392,14 @@
       <w:pPr>
         <w:spacing w:line="360" w:lineRule="auto"/>
         <w:ind w:left="360"/>
-      </w:pPr>
-      <w:r>
+        <w:rPr>
+          <w:color w:val="4EA72E" w:themeColor="accent6"/>
+        </w:rPr>
+      </w:pPr>
+      <w:r>
+        <w:rPr>
+          <w:color w:val="4EA72E" w:themeColor="accent6"/>
+        </w:rPr>
         <w:t>4.3 – Back-end</w:t>
       </w:r>
     </w:p>
@@ -356,12 +407,21 @@
       <w:pPr>
         <w:spacing w:line="360" w:lineRule="auto"/>
         <w:ind w:left="360"/>
-      </w:pPr>
-      <w:r>
+        <w:rPr>
+          <w:color w:val="4EA72E" w:themeColor="accent6"/>
+        </w:rPr>
+      </w:pPr>
+      <w:r>
+        <w:rPr>
+          <w:color w:val="4EA72E" w:themeColor="accent6"/>
+        </w:rPr>
         <w:t>4.4 – Front-</w:t>
       </w:r>
       <w:proofErr w:type="spellStart"/>
       <w:r>
+        <w:rPr>
+          <w:color w:val="4EA72E" w:themeColor="accent6"/>
+        </w:rPr>
         <w:t>end</w:t>
       </w:r>
       <w:proofErr w:type="spellEnd"/>
@@ -447,8 +507,14 @@
           <w:numId w:val="2"/>
         </w:numPr>
         <w:spacing w:line="360" w:lineRule="auto"/>
-      </w:pPr>
-      <w:r>
+        <w:rPr>
+          <w:color w:val="4EA72E" w:themeColor="accent6"/>
+        </w:rPr>
+      </w:pPr>
+      <w:r>
+        <w:rPr>
+          <w:color w:val="4EA72E" w:themeColor="accent6"/>
+        </w:rPr>
         <w:t>Referências</w:t>
       </w:r>
     </w:p>

</xml_diff>